<commit_message>
nop som file 3 4 6 | 52s
</commit_message>
<xml_diff>
--- a/doc/N04_3_ApplicationDevelopment_SRS.docx
+++ b/doc/N04_3_ApplicationDevelopment_SRS.docx
@@ -8450,12 +8450,21 @@
           <w:szCs w:val="26"/>
         </w:rPr>
       </w:pPr>
+      <w:proofErr w:type="gramStart"/>
       <w:r>
         <w:rPr>
           <w:rFonts w:ascii="Times New Roman" w:hAnsi="Times New Roman" w:cs="Times New Roman"/>
           <w:b/>
         </w:rPr>
-        <w:t xml:space="preserve">An ninh &amp; Bảo mật: </w:t>
+        <w:t>An</w:t>
+      </w:r>
+      <w:proofErr w:type="gramEnd"/>
+      <w:r>
+        <w:rPr>
+          <w:rFonts w:ascii="Times New Roman" w:hAnsi="Times New Roman" w:cs="Times New Roman"/>
+          <w:b/>
+        </w:rPr>
+        <w:t xml:space="preserve"> ninh &amp; Bảo mật: </w:t>
       </w:r>
       <w:r>
         <w:rPr>
@@ -9485,15 +9494,7 @@
                 <w:sz w:val="28"/>
                 <w:szCs w:val="28"/>
               </w:rPr>
-              <w:t>10</w:t>
-            </w:r>
-            <w:r>
-              <w:rPr>
-                <w:rFonts w:ascii="Times New Roman" w:hAnsi="Times New Roman" w:cs="Times New Roman"/>
-                <w:sz w:val="28"/>
-                <w:szCs w:val="28"/>
-              </w:rPr>
-              <w:t>. Kết thúc.</w:t>
+              <w:t>10. Kết thúc.</w:t>
             </w:r>
           </w:p>
         </w:tc>
@@ -9669,6 +9670,7 @@
         <w:rPr>
           <w:rFonts w:ascii="Times New Roman" w:hAnsi="Times New Roman" w:cs="Times New Roman"/>
           <w:b/>
+          <w:noProof/>
           <w:sz w:val="26"/>
           <w:szCs w:val="26"/>
         </w:rPr>
@@ -12117,15 +12119,7 @@
                 <w:sz w:val="28"/>
                 <w:szCs w:val="28"/>
               </w:rPr>
-              <w:t>11</w:t>
-            </w:r>
-            <w:r>
-              <w:rPr>
-                <w:rFonts w:ascii="Times New Roman" w:hAnsi="Times New Roman" w:cs="Times New Roman"/>
-                <w:sz w:val="28"/>
-                <w:szCs w:val="28"/>
-              </w:rPr>
-              <w:t>. Kết thúc.</w:t>
+              <w:t>11. Kết thúc.</w:t>
             </w:r>
           </w:p>
         </w:tc>
@@ -12416,7 +12410,7 @@
         </w:rPr>
         <w:lastRenderedPageBreak/>
         <w:drawing>
-          <wp:inline distT="0" distB="0" distL="0" distR="0" wp14:anchorId="09F53C3F" wp14:editId="2FE7763B">
+          <wp:inline distT="0" distB="0" distL="0" distR="0" wp14:anchorId="09F53C3F" wp14:editId="432E8DA9">
             <wp:extent cx="5679569" cy="6416168"/>
             <wp:effectExtent l="0" t="0" r="0" b="3810"/>
             <wp:docPr id="1873627441" name="Picture 14"/>
@@ -13655,7 +13649,7 @@
         </w:rPr>
         <w:lastRenderedPageBreak/>
         <w:drawing>
-          <wp:inline distT="0" distB="0" distL="0" distR="0" wp14:anchorId="4B4B9BC7" wp14:editId="4D1D8BA6">
+          <wp:inline distT="0" distB="0" distL="0" distR="0" wp14:anchorId="4B4B9BC7" wp14:editId="4380E719">
             <wp:extent cx="6511925" cy="5568950"/>
             <wp:effectExtent l="0" t="0" r="3175" b="0"/>
             <wp:docPr id="1610512656" name="Picture 41"/>
@@ -14601,15 +14595,7 @@
                 <w:sz w:val="28"/>
                 <w:szCs w:val="28"/>
               </w:rPr>
-              <w:t>10</w:t>
-            </w:r>
-            <w:r>
-              <w:rPr>
-                <w:rFonts w:ascii="Times New Roman" w:hAnsi="Times New Roman" w:cs="Times New Roman"/>
-                <w:sz w:val="28"/>
-                <w:szCs w:val="28"/>
-              </w:rPr>
-              <w:t>. Kết thúc.</w:t>
+              <w:t>10. Kết thúc.</w:t>
             </w:r>
           </w:p>
         </w:tc>
@@ -17302,7 +17288,7 @@
         </w:rPr>
         <w:lastRenderedPageBreak/>
         <w:drawing>
-          <wp:inline distT="0" distB="0" distL="0" distR="0" wp14:anchorId="349AE757" wp14:editId="7C61C05C">
+          <wp:inline distT="0" distB="0" distL="0" distR="0" wp14:anchorId="349AE757" wp14:editId="47AC9946">
             <wp:extent cx="6511925" cy="5052695"/>
             <wp:effectExtent l="0" t="0" r="3175" b="0"/>
             <wp:docPr id="1249621000" name="Picture 38"/>
@@ -18308,15 +18294,7 @@
                 <w:sz w:val="28"/>
                 <w:szCs w:val="28"/>
               </w:rPr>
-              <w:t>10</w:t>
-            </w:r>
-            <w:r>
-              <w:rPr>
-                <w:rFonts w:ascii="Times New Roman" w:hAnsi="Times New Roman" w:cs="Times New Roman"/>
-                <w:sz w:val="28"/>
-                <w:szCs w:val="28"/>
-              </w:rPr>
-              <w:t>. Kết thúc.</w:t>
+              <w:t>10. Kết thúc.</w:t>
             </w:r>
           </w:p>
         </w:tc>
@@ -18420,23 +18398,7 @@
                 <w:sz w:val="28"/>
                 <w:szCs w:val="28"/>
               </w:rPr>
-              <w:t>5.</w:t>
-            </w:r>
-            <w:r>
-              <w:rPr>
-                <w:rFonts w:ascii="Times New Roman" w:hAnsi="Times New Roman" w:cs="Times New Roman"/>
-                <w:sz w:val="28"/>
-                <w:szCs w:val="28"/>
-              </w:rPr>
-              <w:t>2</w:t>
-            </w:r>
-            <w:r>
-              <w:rPr>
-                <w:rFonts w:ascii="Times New Roman" w:hAnsi="Times New Roman" w:cs="Times New Roman"/>
-                <w:sz w:val="28"/>
-                <w:szCs w:val="28"/>
-              </w:rPr>
-              <w:t xml:space="preserve"> </w:t>
+              <w:t xml:space="preserve">5.2 </w:t>
             </w:r>
             <w:r>
               <w:rPr>
@@ -19823,16 +19785,7 @@
           <w:sz w:val="28"/>
           <w:szCs w:val="28"/>
         </w:rPr>
-        <w:t xml:space="preserve"> </w:t>
-      </w:r>
-      <w:r>
-        <w:rPr>
-          <w:rFonts w:ascii="Times New Roman" w:hAnsi="Times New Roman" w:cs="Times New Roman"/>
-          <w:b/>
-          <w:sz w:val="28"/>
-          <w:szCs w:val="28"/>
-        </w:rPr>
-        <w:t>Activity</w:t>
+        <w:t xml:space="preserve"> Activity</w:t>
       </w:r>
     </w:p>
     <w:p>
@@ -19946,7 +19899,7 @@
         </w:rPr>
         <w:lastRenderedPageBreak/>
         <w:drawing>
-          <wp:inline distT="0" distB="0" distL="0" distR="0" wp14:anchorId="29895B91" wp14:editId="2D504B33">
+          <wp:inline distT="0" distB="0" distL="0" distR="0" wp14:anchorId="29895B91" wp14:editId="5941AD92">
             <wp:extent cx="6511925" cy="4912995"/>
             <wp:effectExtent l="0" t="0" r="3175" b="1905"/>
             <wp:docPr id="1116341359" name="Picture 36"/>
@@ -20977,15 +20930,7 @@
                 <w:sz w:val="28"/>
                 <w:szCs w:val="28"/>
               </w:rPr>
-              <w:t>10.</w:t>
-            </w:r>
-            <w:r>
-              <w:rPr>
-                <w:rFonts w:ascii="Times New Roman" w:hAnsi="Times New Roman" w:cs="Times New Roman"/>
-                <w:sz w:val="28"/>
-                <w:szCs w:val="28"/>
-              </w:rPr>
-              <w:t xml:space="preserve"> Kết thúc.</w:t>
+              <w:t>10. Kết thúc.</w:t>
             </w:r>
           </w:p>
         </w:tc>
@@ -21242,7 +21187,7 @@
         </w:rPr>
         <w:lastRenderedPageBreak/>
         <w:drawing>
-          <wp:inline distT="0" distB="0" distL="0" distR="0" wp14:anchorId="0A7D7D3E" wp14:editId="20AD2424">
+          <wp:inline distT="0" distB="0" distL="0" distR="0" wp14:anchorId="0A7D7D3E" wp14:editId="7205880F">
             <wp:extent cx="6511925" cy="4528820"/>
             <wp:effectExtent l="0" t="0" r="3175" b="5080"/>
             <wp:docPr id="85426584" name="Picture 35"/>
@@ -22232,15 +22177,7 @@
                 <w:sz w:val="28"/>
                 <w:szCs w:val="28"/>
               </w:rPr>
-              <w:t>10.</w:t>
-            </w:r>
-            <w:r>
-              <w:rPr>
-                <w:rFonts w:ascii="Times New Roman" w:hAnsi="Times New Roman" w:cs="Times New Roman"/>
-                <w:sz w:val="28"/>
-                <w:szCs w:val="28"/>
-              </w:rPr>
-              <w:t xml:space="preserve"> Kết thúc.</w:t>
+              <w:t>10. Kết thúc.</w:t>
             </w:r>
           </w:p>
         </w:tc>
@@ -22407,7 +22344,7 @@
         </w:rPr>
         <w:lastRenderedPageBreak/>
         <w:drawing>
-          <wp:inline distT="0" distB="0" distL="0" distR="0" wp14:anchorId="1D4C7FFD" wp14:editId="5A343A4B">
+          <wp:inline distT="0" distB="0" distL="0" distR="0" wp14:anchorId="1D4C7FFD" wp14:editId="584BE10D">
             <wp:extent cx="3153291" cy="8275705"/>
             <wp:effectExtent l="0" t="0" r="9525" b="0"/>
             <wp:docPr id="532318859" name="Picture 23"/>
@@ -23068,7 +23005,16 @@
                 <w:sz w:val="28"/>
                 <w:szCs w:val="28"/>
               </w:rPr>
-              <w:t>1. Ngay sau khi bấm Hoàn tất thanh toán,</w:t>
+              <w:t xml:space="preserve">1. Ngay sau khi bấm Hoàn tất thanh </w:t>
+            </w:r>
+            <w:proofErr w:type="gramStart"/>
+            <w:r>
+              <w:rPr>
+                <w:rFonts w:ascii="Times New Roman" w:hAnsi="Times New Roman" w:cs="Times New Roman"/>
+                <w:sz w:val="28"/>
+                <w:szCs w:val="28"/>
+              </w:rPr>
+              <w:t>toán,</w:t>
             </w:r>
             <w:r>
               <w:rPr>
@@ -23078,6 +23024,7 @@
               </w:rPr>
               <w:t>chọn</w:t>
             </w:r>
+            <w:proofErr w:type="gramEnd"/>
             <w:r>
               <w:rPr>
                 <w:rFonts w:ascii="Times New Roman" w:hAnsi="Times New Roman" w:cs="Times New Roman"/>
@@ -23321,15 +23268,7 @@
                 <w:sz w:val="28"/>
                 <w:szCs w:val="28"/>
               </w:rPr>
-              <w:t xml:space="preserve">6. </w:t>
-            </w:r>
-            <w:r>
-              <w:rPr>
-                <w:rFonts w:ascii="Times New Roman" w:hAnsi="Times New Roman" w:cs="Times New Roman"/>
-                <w:sz w:val="28"/>
-                <w:szCs w:val="28"/>
-              </w:rPr>
-              <w:t>Kết thúc.</w:t>
+              <w:t>6. Kết thúc.</w:t>
             </w:r>
           </w:p>
         </w:tc>
@@ -24538,15 +24477,7 @@
                 <w:sz w:val="28"/>
                 <w:szCs w:val="28"/>
               </w:rPr>
-              <w:t>10.</w:t>
-            </w:r>
-            <w:r>
-              <w:rPr>
-                <w:rFonts w:ascii="Times New Roman" w:hAnsi="Times New Roman" w:cs="Times New Roman"/>
-                <w:sz w:val="28"/>
-                <w:szCs w:val="28"/>
-              </w:rPr>
-              <w:t xml:space="preserve"> Kết thúc.</w:t>
+              <w:t>10. Kết thúc.</w:t>
             </w:r>
           </w:p>
         </w:tc>
@@ -24779,7 +24710,7 @@
         </w:rPr>
         <w:lastRenderedPageBreak/>
         <w:drawing>
-          <wp:inline distT="0" distB="0" distL="0" distR="0" wp14:anchorId="012B249C" wp14:editId="38F2EB28">
+          <wp:inline distT="0" distB="0" distL="0" distR="0" wp14:anchorId="012B249C" wp14:editId="756C56D3">
             <wp:extent cx="6511925" cy="4892675"/>
             <wp:effectExtent l="0" t="0" r="3175" b="3175"/>
             <wp:docPr id="1912595742" name="Picture 32"/>
@@ -25995,15 +25926,7 @@
                 <w:sz w:val="28"/>
                 <w:szCs w:val="28"/>
               </w:rPr>
-              <w:t>9.</w:t>
-            </w:r>
-            <w:r>
-              <w:rPr>
-                <w:rFonts w:ascii="Times New Roman" w:hAnsi="Times New Roman" w:cs="Times New Roman"/>
-                <w:sz w:val="28"/>
-                <w:szCs w:val="28"/>
-              </w:rPr>
-              <w:t xml:space="preserve"> Kết thúc.</w:t>
+              <w:t>9. Kết thúc.</w:t>
             </w:r>
           </w:p>
         </w:tc>
@@ -27391,15 +27314,7 @@
                 <w:sz w:val="28"/>
                 <w:szCs w:val="28"/>
               </w:rPr>
-              <w:t>7.</w:t>
-            </w:r>
-            <w:r>
-              <w:rPr>
-                <w:rFonts w:ascii="Times New Roman" w:hAnsi="Times New Roman" w:cs="Times New Roman"/>
-                <w:sz w:val="28"/>
-                <w:szCs w:val="28"/>
-              </w:rPr>
-              <w:t xml:space="preserve"> Kết thúc.</w:t>
+              <w:t>7. Kết thúc.</w:t>
             </w:r>
           </w:p>
         </w:tc>
@@ -28910,15 +28825,7 @@
                 <w:sz w:val="28"/>
                 <w:szCs w:val="28"/>
               </w:rPr>
-              <w:t>9.</w:t>
-            </w:r>
-            <w:r>
-              <w:rPr>
-                <w:rFonts w:ascii="Times New Roman" w:hAnsi="Times New Roman" w:cs="Times New Roman"/>
-                <w:sz w:val="28"/>
-                <w:szCs w:val="28"/>
-              </w:rPr>
-              <w:t xml:space="preserve"> Kết thúc.</w:t>
+              <w:t>9. Kết thúc.</w:t>
             </w:r>
           </w:p>
         </w:tc>
@@ -29114,7 +29021,7 @@
           <w:noProof/>
         </w:rPr>
         <w:drawing>
-          <wp:inline distT="0" distB="0" distL="0" distR="0" wp14:anchorId="2F645DDC" wp14:editId="621EA808">
+          <wp:inline distT="0" distB="0" distL="0" distR="0" wp14:anchorId="2F645DDC" wp14:editId="77AE5128">
             <wp:extent cx="2595011" cy="6546797"/>
             <wp:effectExtent l="0" t="0" r="0" b="6985"/>
             <wp:docPr id="22644263" name="Picture 27"/>
@@ -29191,24 +29098,65 @@
     </w:p>
     <w:p>
       <w:pPr>
-        <w:pStyle w:val="ListParagraph"/>
-        <w:ind w:left="1080"/>
         <w:rPr>
           <w:rFonts w:ascii="Times New Roman" w:eastAsia="Arial" w:hAnsi="Times New Roman" w:cs="Times New Roman"/>
           <w:sz w:val="26"/>
           <w:szCs w:val="26"/>
-          <w:lang w:val="vi-VN"/>
         </w:rPr>
       </w:pPr>
       <w:r>
         <w:rPr>
-          <w:rFonts w:ascii="Times New Roman" w:hAnsi="Times New Roman" w:cs="Times New Roman"/>
-          <w:sz w:val="26"/>
-          <w:szCs w:val="26"/>
-          <w:lang w:val="vi-VN"/>
+          <w:noProof/>
         </w:rPr>
         <w:lastRenderedPageBreak/>
-        <w:br w:type="page"/>
+        <w:drawing>
+          <wp:inline distT="0" distB="0" distL="0" distR="0" wp14:anchorId="6184C424" wp14:editId="25C0FCC8">
+            <wp:extent cx="6050483" cy="4941277"/>
+            <wp:effectExtent l="0" t="0" r="7620" b="0"/>
+            <wp:docPr id="1735015515" name="Picture 8"/>
+            <wp:cNvGraphicFramePr>
+              <a:graphicFrameLocks xmlns:a="http://schemas.openxmlformats.org/drawingml/2006/main" noChangeAspect="1"/>
+            </wp:cNvGraphicFramePr>
+            <a:graphic xmlns:a="http://schemas.openxmlformats.org/drawingml/2006/main">
+              <a:graphicData uri="http://schemas.openxmlformats.org/drawingml/2006/picture">
+                <pic:pic xmlns:pic="http://schemas.openxmlformats.org/drawingml/2006/picture">
+                  <pic:nvPicPr>
+                    <pic:cNvPr id="0" name="Picture 6"/>
+                    <pic:cNvPicPr>
+                      <a:picLocks noChangeAspect="1" noChangeArrowheads="1"/>
+                    </pic:cNvPicPr>
+                  </pic:nvPicPr>
+                  <pic:blipFill>
+                    <a:blip r:embed="rId42" cstate="print">
+                      <a:extLst>
+                        <a:ext uri="{28A0092B-C50C-407E-A947-70E740481C1C}">
+                          <a14:useLocalDpi xmlns:a14="http://schemas.microsoft.com/office/drawing/2010/main" val="0"/>
+                        </a:ext>
+                      </a:extLst>
+                    </a:blip>
+                    <a:srcRect/>
+                    <a:stretch>
+                      <a:fillRect/>
+                    </a:stretch>
+                  </pic:blipFill>
+                  <pic:spPr bwMode="auto">
+                    <a:xfrm>
+                      <a:off x="0" y="0"/>
+                      <a:ext cx="6053118" cy="4943429"/>
+                    </a:xfrm>
+                    <a:prstGeom prst="rect">
+                      <a:avLst/>
+                    </a:prstGeom>
+                    <a:noFill/>
+                    <a:ln>
+                      <a:noFill/>
+                    </a:ln>
+                  </pic:spPr>
+                </pic:pic>
+              </a:graphicData>
+            </a:graphic>
+          </wp:inline>
+        </w:drawing>
       </w:r>
     </w:p>
     <w:p>
@@ -29300,7 +29248,7 @@
                     </pic:cNvPicPr>
                   </pic:nvPicPr>
                   <pic:blipFill>
-                    <a:blip r:embed="rId42">
+                    <a:blip r:embed="rId43">
                       <a:extLst>
                         <a:ext uri="{28A0092B-C50C-407E-A947-70E740481C1C}">
                           <a14:useLocalDpi xmlns:a14="http://schemas.microsoft.com/office/drawing/2010/main" val="0"/>
@@ -29348,6 +29296,7 @@
           <w:sz w:val="22"/>
           <w:szCs w:val="18"/>
         </w:rPr>
+        <w:lastRenderedPageBreak/>
         <w:t>Biểu đồ lớp tổng quát:</w:t>
       </w:r>
       <w:bookmarkEnd w:id="26"/>
@@ -29389,445 +29338,6 @@
         <w:t xml:space="preserve"> Lớp Entity</w:t>
       </w:r>
     </w:p>
-    <w:tbl>
-      <w:tblPr>
-        <w:tblStyle w:val="TableGrid"/>
-        <w:tblpPr w:leftFromText="180" w:rightFromText="180" w:vertAnchor="text" w:horzAnchor="page" w:tblpX="1956" w:tblpY="368"/>
-        <w:tblW w:w="0" w:type="auto"/>
-        <w:shd w:val="clear" w:color="auto" w:fill="FBE4D5" w:themeFill="accent2" w:themeFillTint="33"/>
-        <w:tblLook w:val="04A0" w:firstRow="1" w:lastRow="0" w:firstColumn="1" w:lastColumn="0" w:noHBand="0" w:noVBand="1"/>
-      </w:tblPr>
-      <w:tblGrid>
-        <w:gridCol w:w="1654"/>
-      </w:tblGrid>
-      <w:tr>
-        <w:tc>
-          <w:tcPr>
-            <w:tcW w:w="1557" w:type="dxa"/>
-            <w:shd w:val="clear" w:color="auto" w:fill="FBE4D5" w:themeFill="accent2" w:themeFillTint="33"/>
-          </w:tcPr>
-          <w:p>
-            <w:pPr>
-              <w:rPr>
-                <w:rFonts w:ascii="Times New Roman" w:hAnsi="Times New Roman" w:cs="Times New Roman"/>
-                <w:i/>
-                <w:iCs/>
-              </w:rPr>
-            </w:pPr>
-            <w:r>
-              <w:rPr>
-                <w:rFonts w:ascii="Times New Roman" w:hAnsi="Times New Roman" w:cs="Times New Roman"/>
-                <w:i/>
-                <w:iCs/>
-              </w:rPr>
-              <w:t>&lt;&lt;boundary&gt;&gt;</w:t>
-            </w:r>
-          </w:p>
-          <w:p>
-            <w:pPr>
-              <w:rPr>
-                <w:rFonts w:ascii="Times New Roman" w:hAnsi="Times New Roman" w:cs="Times New Roman"/>
-              </w:rPr>
-            </w:pPr>
-            <w:r>
-              <w:rPr>
-                <w:rFonts w:ascii="Times New Roman" w:hAnsi="Times New Roman" w:cs="Times New Roman"/>
-                <w:noProof/>
-              </w:rPr>
-              <mc:AlternateContent>
-                <mc:Choice Requires="wps">
-                  <w:drawing>
-                    <wp:anchor distT="0" distB="0" distL="114300" distR="114300" simplePos="0" relativeHeight="251662336" behindDoc="0" locked="0" layoutInCell="1" allowOverlap="1" wp14:anchorId="7DB77F3B" wp14:editId="46D9F348">
-                      <wp:simplePos x="0" y="0"/>
-                      <wp:positionH relativeFrom="column">
-                        <wp:posOffset>911405</wp:posOffset>
-                      </wp:positionH>
-                      <wp:positionV relativeFrom="paragraph">
-                        <wp:posOffset>132317</wp:posOffset>
-                      </wp:positionV>
-                      <wp:extent cx="757451" cy="348018"/>
-                      <wp:effectExtent l="0" t="0" r="17780" b="20320"/>
-                      <wp:wrapNone/>
-                      <wp:docPr id="2" name="Straight Connector 2"/>
-                      <wp:cNvGraphicFramePr/>
-                      <a:graphic xmlns:a="http://schemas.openxmlformats.org/drawingml/2006/main">
-                        <a:graphicData uri="http://schemas.microsoft.com/office/word/2010/wordprocessingShape">
-                          <wps:wsp>
-                            <wps:cNvCnPr/>
-                            <wps:spPr>
-                              <a:xfrm>
-                                <a:off x="0" y="0"/>
-                                <a:ext cx="757451" cy="348018"/>
-                              </a:xfrm>
-                              <a:prstGeom prst="line">
-                                <a:avLst/>
-                              </a:prstGeom>
-                            </wps:spPr>
-                            <wps:style>
-                              <a:lnRef idx="1">
-                                <a:schemeClr val="accent1"/>
-                              </a:lnRef>
-                              <a:fillRef idx="0">
-                                <a:schemeClr val="accent1"/>
-                              </a:fillRef>
-                              <a:effectRef idx="0">
-                                <a:schemeClr val="accent1"/>
-                              </a:effectRef>
-                              <a:fontRef idx="minor">
-                                <a:schemeClr val="tx1"/>
-                              </a:fontRef>
-                            </wps:style>
-                            <wps:bodyPr/>
-                          </wps:wsp>
-                        </a:graphicData>
-                      </a:graphic>
-                    </wp:anchor>
-                  </w:drawing>
-                </mc:Choice>
-                <mc:Fallback>
-                  <w:pict>
-                    <v:line w14:anchorId="20454FE2" id="Straight Connector 2" o:spid="_x0000_s1026" style="position:absolute;z-index:251662336;visibility:visible;mso-wrap-style:square;mso-wrap-distance-left:9pt;mso-wrap-distance-top:0;mso-wrap-distance-right:9pt;mso-wrap-distance-bottom:0;mso-position-horizontal:absolute;mso-position-horizontal-relative:text;mso-position-vertical:absolute;mso-position-vertical-relative:text" from="71.75pt,10.4pt" to="131.4pt,37.8pt" o:gfxdata="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" strokecolor="#5b9bd5 [3204]" strokeweight=".5pt">
-                      <v:stroke joinstyle="miter"/>
-                    </v:line>
-                  </w:pict>
-                </mc:Fallback>
-              </mc:AlternateContent>
-            </w:r>
-            <w:r>
-              <w:rPr>
-                <w:rFonts w:ascii="Times New Roman" w:hAnsi="Times New Roman" w:cs="Times New Roman"/>
-              </w:rPr>
-              <w:t>GUI_aaa</w:t>
-            </w:r>
-          </w:p>
-        </w:tc>
-      </w:tr>
-      <w:tr>
-        <w:tc>
-          <w:tcPr>
-            <w:tcW w:w="1557" w:type="dxa"/>
-            <w:shd w:val="clear" w:color="auto" w:fill="FBE4D5" w:themeFill="accent2" w:themeFillTint="33"/>
-          </w:tcPr>
-          <w:p>
-            <w:pPr>
-              <w:rPr>
-                <w:rFonts w:ascii="Times New Roman" w:hAnsi="Times New Roman" w:cs="Times New Roman"/>
-              </w:rPr>
-            </w:pPr>
-          </w:p>
-        </w:tc>
-      </w:tr>
-      <w:tr>
-        <w:tc>
-          <w:tcPr>
-            <w:tcW w:w="1557" w:type="dxa"/>
-            <w:shd w:val="clear" w:color="auto" w:fill="FBE4D5" w:themeFill="accent2" w:themeFillTint="33"/>
-          </w:tcPr>
-          <w:p>
-            <w:pPr>
-              <w:rPr>
-                <w:rFonts w:ascii="Times New Roman" w:hAnsi="Times New Roman" w:cs="Times New Roman"/>
-              </w:rPr>
-            </w:pPr>
-            <w:r>
-              <w:rPr>
-                <w:rFonts w:ascii="Times New Roman" w:hAnsi="Times New Roman" w:cs="Times New Roman"/>
-              </w:rPr>
-              <w:t xml:space="preserve">  </w:t>
-            </w:r>
-          </w:p>
-        </w:tc>
-      </w:tr>
-    </w:tbl>
-    <w:p>
-      <w:pPr>
-        <w:rPr>
-          <w:rFonts w:ascii="Times New Roman" w:hAnsi="Times New Roman" w:cs="Times New Roman"/>
-        </w:rPr>
-      </w:pPr>
-    </w:p>
-    <w:tbl>
-      <w:tblPr>
-        <w:tblStyle w:val="TableGrid"/>
-        <w:tblpPr w:leftFromText="180" w:rightFromText="180" w:vertAnchor="text" w:horzAnchor="page" w:tblpX="8394" w:tblpY="360"/>
-        <w:tblW w:w="0" w:type="auto"/>
-        <w:shd w:val="clear" w:color="auto" w:fill="D9E2F3" w:themeFill="accent5" w:themeFillTint="33"/>
-        <w:tblLook w:val="04A0" w:firstRow="1" w:lastRow="0" w:firstColumn="1" w:lastColumn="0" w:noHBand="0" w:noVBand="1"/>
-      </w:tblPr>
-      <w:tblGrid>
-        <w:gridCol w:w="1696"/>
-      </w:tblGrid>
-      <w:tr>
-        <w:tc>
-          <w:tcPr>
-            <w:tcW w:w="1696" w:type="dxa"/>
-            <w:shd w:val="clear" w:color="auto" w:fill="D9E2F3" w:themeFill="accent5" w:themeFillTint="33"/>
-          </w:tcPr>
-          <w:p>
-            <w:pPr>
-              <w:rPr>
-                <w:rFonts w:ascii="Times New Roman" w:hAnsi="Times New Roman" w:cs="Times New Roman"/>
-                <w:i/>
-                <w:iCs/>
-              </w:rPr>
-            </w:pPr>
-            <w:r>
-              <w:rPr>
-                <w:rFonts w:ascii="Times New Roman" w:hAnsi="Times New Roman" w:cs="Times New Roman"/>
-                <w:i/>
-                <w:iCs/>
-              </w:rPr>
-              <w:t>&lt;&lt;Entity&gt;&gt;</w:t>
-            </w:r>
-          </w:p>
-          <w:p>
-            <w:pPr>
-              <w:rPr>
-                <w:rFonts w:ascii="Times New Roman" w:hAnsi="Times New Roman" w:cs="Times New Roman"/>
-              </w:rPr>
-            </w:pPr>
-            <w:r>
-              <w:rPr>
-                <w:rFonts w:ascii="Times New Roman" w:hAnsi="Times New Roman" w:cs="Times New Roman"/>
-              </w:rPr>
-              <w:t xml:space="preserve">       AA</w:t>
-            </w:r>
-          </w:p>
-        </w:tc>
-      </w:tr>
-      <w:tr>
-        <w:tc>
-          <w:tcPr>
-            <w:tcW w:w="1696" w:type="dxa"/>
-            <w:shd w:val="clear" w:color="auto" w:fill="D9E2F3" w:themeFill="accent5" w:themeFillTint="33"/>
-          </w:tcPr>
-          <w:p>
-            <w:pPr>
-              <w:pStyle w:val="ListParagraph"/>
-              <w:numPr>
-                <w:ilvl w:val="0"/>
-                <w:numId w:val="21"/>
-              </w:numPr>
-              <w:rPr>
-                <w:rFonts w:ascii="Times New Roman" w:hAnsi="Times New Roman" w:cs="Times New Roman"/>
-              </w:rPr>
-            </w:pPr>
-            <w:r>
-              <w:rPr>
-                <w:rFonts w:ascii="Times New Roman" w:hAnsi="Times New Roman" w:cs="Times New Roman"/>
-              </w:rPr>
-              <w:t>a1</w:t>
-            </w:r>
-          </w:p>
-          <w:p>
-            <w:pPr>
-              <w:pStyle w:val="ListParagraph"/>
-              <w:numPr>
-                <w:ilvl w:val="0"/>
-                <w:numId w:val="21"/>
-              </w:numPr>
-              <w:rPr>
-                <w:rFonts w:ascii="Times New Roman" w:hAnsi="Times New Roman" w:cs="Times New Roman"/>
-              </w:rPr>
-            </w:pPr>
-            <w:r>
-              <w:rPr>
-                <w:rFonts w:ascii="Times New Roman" w:hAnsi="Times New Roman" w:cs="Times New Roman"/>
-              </w:rPr>
-              <w:t>a2</w:t>
-            </w:r>
-          </w:p>
-        </w:tc>
-      </w:tr>
-      <w:tr>
-        <w:tc>
-          <w:tcPr>
-            <w:tcW w:w="1696" w:type="dxa"/>
-            <w:shd w:val="clear" w:color="auto" w:fill="D9E2F3" w:themeFill="accent5" w:themeFillTint="33"/>
-          </w:tcPr>
-          <w:p>
-            <w:pPr>
-              <w:rPr>
-                <w:rFonts w:ascii="Times New Roman" w:hAnsi="Times New Roman" w:cs="Times New Roman"/>
-              </w:rPr>
-            </w:pPr>
-            <w:r>
-              <w:rPr>
-                <w:rFonts w:ascii="Times New Roman" w:hAnsi="Times New Roman" w:cs="Times New Roman"/>
-                <w:sz w:val="20"/>
-                <w:szCs w:val="20"/>
-              </w:rPr>
-              <w:t>+toString(): String</w:t>
-            </w:r>
-          </w:p>
-        </w:tc>
-      </w:tr>
-    </w:tbl>
-    <w:p>
-      <w:pPr>
-        <w:rPr>
-          <w:rFonts w:ascii="Times New Roman" w:hAnsi="Times New Roman" w:cs="Times New Roman"/>
-        </w:rPr>
-      </w:pPr>
-    </w:p>
-    <w:tbl>
-      <w:tblPr>
-        <w:tblStyle w:val="TableGrid"/>
-        <w:tblpPr w:leftFromText="180" w:rightFromText="180" w:vertAnchor="text" w:horzAnchor="page" w:tblpX="4687" w:tblpY="18"/>
-        <w:tblW w:w="0" w:type="auto"/>
-        <w:shd w:val="clear" w:color="auto" w:fill="FFF2CC" w:themeFill="accent4" w:themeFillTint="33"/>
-        <w:tblLook w:val="04A0" w:firstRow="1" w:lastRow="0" w:firstColumn="1" w:lastColumn="0" w:noHBand="0" w:noVBand="1"/>
-      </w:tblPr>
-      <w:tblGrid>
-        <w:gridCol w:w="1557"/>
-      </w:tblGrid>
-      <w:tr>
-        <w:tc>
-          <w:tcPr>
-            <w:tcW w:w="1557" w:type="dxa"/>
-            <w:shd w:val="clear" w:color="auto" w:fill="FFF2CC" w:themeFill="accent4" w:themeFillTint="33"/>
-          </w:tcPr>
-          <w:p>
-            <w:pPr>
-              <w:rPr>
-                <w:rFonts w:ascii="Times New Roman" w:hAnsi="Times New Roman" w:cs="Times New Roman"/>
-                <w:i/>
-                <w:iCs/>
-              </w:rPr>
-            </w:pPr>
-            <w:r>
-              <w:rPr>
-                <w:rFonts w:ascii="Times New Roman" w:hAnsi="Times New Roman" w:cs="Times New Roman"/>
-                <w:i/>
-                <w:iCs/>
-              </w:rPr>
-              <w:t>&lt;&lt;Control&gt;&gt;</w:t>
-            </w:r>
-          </w:p>
-          <w:p>
-            <w:pPr>
-              <w:rPr>
-                <w:rFonts w:ascii="Times New Roman" w:hAnsi="Times New Roman" w:cs="Times New Roman"/>
-              </w:rPr>
-            </w:pPr>
-            <w:r>
-              <w:rPr>
-                <w:rFonts w:ascii="Times New Roman" w:hAnsi="Times New Roman" w:cs="Times New Roman"/>
-                <w:noProof/>
-              </w:rPr>
-              <mc:AlternateContent>
-                <mc:Choice Requires="wps">
-                  <w:drawing>
-                    <wp:anchor distT="0" distB="0" distL="114300" distR="114300" simplePos="0" relativeHeight="251664384" behindDoc="0" locked="0" layoutInCell="1" allowOverlap="1" wp14:anchorId="4978D279" wp14:editId="3558C748">
-                      <wp:simplePos x="0" y="0"/>
-                      <wp:positionH relativeFrom="column">
-                        <wp:posOffset>917310</wp:posOffset>
-                      </wp:positionH>
-                      <wp:positionV relativeFrom="paragraph">
-                        <wp:posOffset>63481</wp:posOffset>
-                      </wp:positionV>
-                      <wp:extent cx="1351128" cy="0"/>
-                      <wp:effectExtent l="0" t="0" r="8255" b="12700"/>
-                      <wp:wrapNone/>
-                      <wp:docPr id="4" name="Straight Connector 4"/>
-                      <wp:cNvGraphicFramePr/>
-                      <a:graphic xmlns:a="http://schemas.openxmlformats.org/drawingml/2006/main">
-                        <a:graphicData uri="http://schemas.microsoft.com/office/word/2010/wordprocessingShape">
-                          <wps:wsp>
-                            <wps:cNvCnPr/>
-                            <wps:spPr>
-                              <a:xfrm>
-                                <a:off x="0" y="0"/>
-                                <a:ext cx="1351128" cy="0"/>
-                              </a:xfrm>
-                              <a:prstGeom prst="line">
-                                <a:avLst/>
-                              </a:prstGeom>
-                            </wps:spPr>
-                            <wps:style>
-                              <a:lnRef idx="1">
-                                <a:schemeClr val="accent1"/>
-                              </a:lnRef>
-                              <a:fillRef idx="0">
-                                <a:schemeClr val="accent1"/>
-                              </a:fillRef>
-                              <a:effectRef idx="0">
-                                <a:schemeClr val="accent1"/>
-                              </a:effectRef>
-                              <a:fontRef idx="minor">
-                                <a:schemeClr val="tx1"/>
-                              </a:fontRef>
-                            </wps:style>
-                            <wps:bodyPr/>
-                          </wps:wsp>
-                        </a:graphicData>
-                      </a:graphic>
-                    </wp:anchor>
-                  </w:drawing>
-                </mc:Choice>
-                <mc:Fallback>
-                  <w:pict>
-                    <v:line w14:anchorId="675AE3B0" id="Straight Connector 4" o:spid="_x0000_s1026" style="position:absolute;z-index:251664384;visibility:visible;mso-wrap-style:square;mso-wrap-distance-left:9pt;mso-wrap-distance-top:0;mso-wrap-distance-right:9pt;mso-wrap-distance-bottom:0;mso-position-horizontal:absolute;mso-position-horizontal-relative:text;mso-position-vertical:absolute;mso-position-vertical-relative:text" from="72.25pt,5pt" to="178.65pt,5pt" o:gfxdata="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" strokecolor="#5b9bd5 [3204]" strokeweight=".5pt">
-                      <v:stroke joinstyle="miter"/>
-                    </v:line>
-                  </w:pict>
-                </mc:Fallback>
-              </mc:AlternateContent>
-            </w:r>
-            <w:r>
-              <w:rPr>
-                <w:rFonts w:ascii="Times New Roman" w:hAnsi="Times New Roman" w:cs="Times New Roman"/>
-              </w:rPr>
-              <w:t xml:space="preserve">     aaaaaa</w:t>
-            </w:r>
-          </w:p>
-        </w:tc>
-      </w:tr>
-      <w:tr>
-        <w:tc>
-          <w:tcPr>
-            <w:tcW w:w="1557" w:type="dxa"/>
-            <w:shd w:val="clear" w:color="auto" w:fill="FFF2CC" w:themeFill="accent4" w:themeFillTint="33"/>
-          </w:tcPr>
-          <w:p>
-            <w:pPr>
-              <w:rPr>
-                <w:rFonts w:ascii="Times New Roman" w:hAnsi="Times New Roman" w:cs="Times New Roman"/>
-              </w:rPr>
-            </w:pPr>
-          </w:p>
-        </w:tc>
-      </w:tr>
-      <w:tr>
-        <w:tc>
-          <w:tcPr>
-            <w:tcW w:w="1557" w:type="dxa"/>
-            <w:shd w:val="clear" w:color="auto" w:fill="FFF2CC" w:themeFill="accent4" w:themeFillTint="33"/>
-          </w:tcPr>
-          <w:p>
-            <w:pPr>
-              <w:rPr>
-                <w:rFonts w:ascii="Times New Roman" w:hAnsi="Times New Roman" w:cs="Times New Roman"/>
-              </w:rPr>
-            </w:pPr>
-          </w:p>
-        </w:tc>
-      </w:tr>
-    </w:tbl>
-    <w:p>
-      <w:pPr>
-        <w:rPr>
-          <w:rFonts w:ascii="Times New Roman" w:hAnsi="Times New Roman" w:cs="Times New Roman"/>
-        </w:rPr>
-      </w:pPr>
-    </w:p>
-    <w:p>
-      <w:pPr>
-        <w:rPr>
-          <w:rFonts w:ascii="Times New Roman" w:hAnsi="Times New Roman" w:cs="Times New Roman"/>
-        </w:rPr>
-      </w:pPr>
-    </w:p>
     <w:p>
       <w:pPr>
         <w:rPr>
@@ -29837,351 +29347,43 @@
       <w:r>
         <w:rPr>
           <w:rFonts w:ascii="Times New Roman" w:hAnsi="Times New Roman" w:cs="Times New Roman"/>
-          <w:noProof/>
         </w:rPr>
-        <mc:AlternateContent>
-          <mc:Choice Requires="wps">
-            <w:drawing>
-              <wp:anchor distT="0" distB="0" distL="114300" distR="114300" simplePos="0" relativeHeight="251665408" behindDoc="0" locked="0" layoutInCell="1" allowOverlap="1" wp14:anchorId="5FADFF87" wp14:editId="334D132B">
-                <wp:simplePos x="0" y="0"/>
-                <wp:positionH relativeFrom="column">
-                  <wp:posOffset>5121152</wp:posOffset>
-                </wp:positionH>
-                <wp:positionV relativeFrom="paragraph">
-                  <wp:posOffset>253782</wp:posOffset>
-                </wp:positionV>
-                <wp:extent cx="0" cy="443552"/>
-                <wp:effectExtent l="0" t="0" r="12700" b="13970"/>
-                <wp:wrapNone/>
-                <wp:docPr id="5" name="Straight Connector 5"/>
-                <wp:cNvGraphicFramePr/>
-                <a:graphic xmlns:a="http://schemas.openxmlformats.org/drawingml/2006/main">
-                  <a:graphicData uri="http://schemas.microsoft.com/office/word/2010/wordprocessingShape">
-                    <wps:wsp>
-                      <wps:cNvCnPr/>
-                      <wps:spPr>
-                        <a:xfrm>
-                          <a:off x="0" y="0"/>
-                          <a:ext cx="0" cy="443552"/>
-                        </a:xfrm>
-                        <a:prstGeom prst="line">
-                          <a:avLst/>
-                        </a:prstGeom>
-                      </wps:spPr>
-                      <wps:style>
-                        <a:lnRef idx="1">
-                          <a:schemeClr val="accent1"/>
-                        </a:lnRef>
-                        <a:fillRef idx="0">
-                          <a:schemeClr val="accent1"/>
-                        </a:fillRef>
-                        <a:effectRef idx="0">
-                          <a:schemeClr val="accent1"/>
-                        </a:effectRef>
-                        <a:fontRef idx="minor">
-                          <a:schemeClr val="tx1"/>
-                        </a:fontRef>
-                      </wps:style>
-                      <wps:bodyPr/>
-                    </wps:wsp>
-                  </a:graphicData>
-                </a:graphic>
-              </wp:anchor>
-            </w:drawing>
-          </mc:Choice>
-          <mc:Fallback>
-            <w:pict>
-              <v:line w14:anchorId="1ADCF60B" id="Straight Connector 5" o:spid="_x0000_s1026" style="position:absolute;z-index:251665408;visibility:visible;mso-wrap-style:square;mso-wrap-distance-left:9pt;mso-wrap-distance-top:0;mso-wrap-distance-right:9pt;mso-wrap-distance-bottom:0;mso-position-horizontal:absolute;mso-position-horizontal-relative:text;mso-position-vertical:absolute;mso-position-vertical-relative:text" from="403.25pt,20pt" to="403.25pt,54.95pt" o:gfxdata="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" strokecolor="#5b9bd5 [3204]" strokeweight=".5pt">
-                <v:stroke joinstyle="miter"/>
-              </v:line>
-            </w:pict>
-          </mc:Fallback>
-        </mc:AlternateContent>
+        <w:drawing>
+          <wp:inline distT="0" distB="0" distL="0" distR="0" wp14:anchorId="268C9E1A" wp14:editId="7145C138">
+            <wp:extent cx="6511925" cy="2288540"/>
+            <wp:effectExtent l="0" t="0" r="3175" b="0"/>
+            <wp:docPr id="1406917901" name="Picture 1"/>
+            <wp:cNvGraphicFramePr>
+              <a:graphicFrameLocks xmlns:a="http://schemas.openxmlformats.org/drawingml/2006/main" noChangeAspect="1"/>
+            </wp:cNvGraphicFramePr>
+            <a:graphic xmlns:a="http://schemas.openxmlformats.org/drawingml/2006/main">
+              <a:graphicData uri="http://schemas.openxmlformats.org/drawingml/2006/picture">
+                <pic:pic xmlns:pic="http://schemas.openxmlformats.org/drawingml/2006/picture">
+                  <pic:nvPicPr>
+                    <pic:cNvPr id="1406917901" name=""/>
+                    <pic:cNvPicPr/>
+                  </pic:nvPicPr>
+                  <pic:blipFill>
+                    <a:blip r:embed="rId44"/>
+                    <a:stretch>
+                      <a:fillRect/>
+                    </a:stretch>
+                  </pic:blipFill>
+                  <pic:spPr>
+                    <a:xfrm>
+                      <a:off x="0" y="0"/>
+                      <a:ext cx="6511925" cy="2288540"/>
+                    </a:xfrm>
+                    <a:prstGeom prst="rect">
+                      <a:avLst/>
+                    </a:prstGeom>
+                  </pic:spPr>
+                </pic:pic>
+              </a:graphicData>
+            </a:graphic>
+          </wp:inline>
+        </w:drawing>
       </w:r>
-      <w:r>
-        <w:rPr>
-          <w:rFonts w:ascii="Times New Roman" w:hAnsi="Times New Roman" w:cs="Times New Roman"/>
-          <w:noProof/>
-        </w:rPr>
-        <mc:AlternateContent>
-          <mc:Choice Requires="wps">
-            <w:drawing>
-              <wp:anchor distT="0" distB="0" distL="114300" distR="114300" simplePos="0" relativeHeight="251663360" behindDoc="0" locked="0" layoutInCell="1" allowOverlap="1" wp14:anchorId="2C92C43D" wp14:editId="78206007">
-                <wp:simplePos x="0" y="0"/>
-                <wp:positionH relativeFrom="column">
-                  <wp:posOffset>2739617</wp:posOffset>
-                </wp:positionH>
-                <wp:positionV relativeFrom="paragraph">
-                  <wp:posOffset>158248</wp:posOffset>
-                </wp:positionV>
-                <wp:extent cx="0" cy="457200"/>
-                <wp:effectExtent l="0" t="0" r="12700" b="12700"/>
-                <wp:wrapNone/>
-                <wp:docPr id="3" name="Straight Connector 3"/>
-                <wp:cNvGraphicFramePr/>
-                <a:graphic xmlns:a="http://schemas.openxmlformats.org/drawingml/2006/main">
-                  <a:graphicData uri="http://schemas.microsoft.com/office/word/2010/wordprocessingShape">
-                    <wps:wsp>
-                      <wps:cNvCnPr/>
-                      <wps:spPr>
-                        <a:xfrm>
-                          <a:off x="0" y="0"/>
-                          <a:ext cx="0" cy="457200"/>
-                        </a:xfrm>
-                        <a:prstGeom prst="line">
-                          <a:avLst/>
-                        </a:prstGeom>
-                      </wps:spPr>
-                      <wps:style>
-                        <a:lnRef idx="1">
-                          <a:schemeClr val="accent1"/>
-                        </a:lnRef>
-                        <a:fillRef idx="0">
-                          <a:schemeClr val="accent1"/>
-                        </a:fillRef>
-                        <a:effectRef idx="0">
-                          <a:schemeClr val="accent1"/>
-                        </a:effectRef>
-                        <a:fontRef idx="minor">
-                          <a:schemeClr val="tx1"/>
-                        </a:fontRef>
-                      </wps:style>
-                      <wps:bodyPr/>
-                    </wps:wsp>
-                  </a:graphicData>
-                </a:graphic>
-              </wp:anchor>
-            </w:drawing>
-          </mc:Choice>
-          <mc:Fallback>
-            <w:pict>
-              <v:line w14:anchorId="606A5493" id="Straight Connector 3" o:spid="_x0000_s1026" style="position:absolute;z-index:251663360;visibility:visible;mso-wrap-style:square;mso-wrap-distance-left:9pt;mso-wrap-distance-top:0;mso-wrap-distance-right:9pt;mso-wrap-distance-bottom:0;mso-position-horizontal:absolute;mso-position-horizontal-relative:text;mso-position-vertical:absolute;mso-position-vertical-relative:text" from="215.7pt,12.45pt" to="215.7pt,48.45pt" o:gfxdata="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" strokecolor="#5b9bd5 [3204]" strokeweight=".5pt">
-                <v:stroke joinstyle="miter"/>
-              </v:line>
-            </w:pict>
-          </mc:Fallback>
-        </mc:AlternateContent>
-      </w:r>
-    </w:p>
-    <w:p>
-      <w:pPr>
-        <w:rPr>
-          <w:rFonts w:ascii="Times New Roman" w:hAnsi="Times New Roman" w:cs="Times New Roman"/>
-        </w:rPr>
-      </w:pPr>
-    </w:p>
-    <w:tbl>
-      <w:tblPr>
-        <w:tblStyle w:val="TableGrid"/>
-        <w:tblpPr w:leftFromText="180" w:rightFromText="180" w:vertAnchor="text" w:horzAnchor="page" w:tblpX="8436" w:tblpY="184"/>
-        <w:tblW w:w="0" w:type="auto"/>
-        <w:shd w:val="clear" w:color="auto" w:fill="D9E2F3" w:themeFill="accent5" w:themeFillTint="33"/>
-        <w:tblLook w:val="04A0" w:firstRow="1" w:lastRow="0" w:firstColumn="1" w:lastColumn="0" w:noHBand="0" w:noVBand="1"/>
-      </w:tblPr>
-      <w:tblGrid>
-        <w:gridCol w:w="1696"/>
-      </w:tblGrid>
-      <w:tr>
-        <w:tc>
-          <w:tcPr>
-            <w:tcW w:w="1696" w:type="dxa"/>
-            <w:shd w:val="clear" w:color="auto" w:fill="D9E2F3" w:themeFill="accent5" w:themeFillTint="33"/>
-          </w:tcPr>
-          <w:p>
-            <w:pPr>
-              <w:rPr>
-                <w:rFonts w:ascii="Times New Roman" w:hAnsi="Times New Roman" w:cs="Times New Roman"/>
-                <w:i/>
-                <w:iCs/>
-              </w:rPr>
-            </w:pPr>
-            <w:r>
-              <w:rPr>
-                <w:rFonts w:ascii="Times New Roman" w:hAnsi="Times New Roman" w:cs="Times New Roman"/>
-                <w:i/>
-                <w:iCs/>
-              </w:rPr>
-              <w:t>&lt;&lt;Entity&gt;&gt;</w:t>
-            </w:r>
-          </w:p>
-          <w:p>
-            <w:pPr>
-              <w:rPr>
-                <w:rFonts w:ascii="Times New Roman" w:hAnsi="Times New Roman" w:cs="Times New Roman"/>
-              </w:rPr>
-            </w:pPr>
-            <w:r>
-              <w:rPr>
-                <w:rFonts w:ascii="Times New Roman" w:hAnsi="Times New Roman" w:cs="Times New Roman"/>
-              </w:rPr>
-              <w:t xml:space="preserve">     BBBB</w:t>
-            </w:r>
-          </w:p>
-        </w:tc>
-      </w:tr>
-      <w:tr>
-        <w:tc>
-          <w:tcPr>
-            <w:tcW w:w="1696" w:type="dxa"/>
-            <w:shd w:val="clear" w:color="auto" w:fill="D9E2F3" w:themeFill="accent5" w:themeFillTint="33"/>
-          </w:tcPr>
-          <w:p>
-            <w:pPr>
-              <w:pStyle w:val="ListParagraph"/>
-              <w:numPr>
-                <w:ilvl w:val="0"/>
-                <w:numId w:val="21"/>
-              </w:numPr>
-              <w:rPr>
-                <w:rFonts w:ascii="Times New Roman" w:hAnsi="Times New Roman" w:cs="Times New Roman"/>
-              </w:rPr>
-            </w:pPr>
-            <w:r>
-              <w:rPr>
-                <w:rFonts w:ascii="Times New Roman" w:hAnsi="Times New Roman" w:cs="Times New Roman"/>
-              </w:rPr>
-              <w:t xml:space="preserve">bb </w:t>
-            </w:r>
-          </w:p>
-        </w:tc>
-      </w:tr>
-      <w:tr>
-        <w:tc>
-          <w:tcPr>
-            <w:tcW w:w="1696" w:type="dxa"/>
-            <w:shd w:val="clear" w:color="auto" w:fill="D9E2F3" w:themeFill="accent5" w:themeFillTint="33"/>
-          </w:tcPr>
-          <w:p>
-            <w:pPr>
-              <w:rPr>
-                <w:rFonts w:ascii="Times New Roman" w:hAnsi="Times New Roman" w:cs="Times New Roman"/>
-              </w:rPr>
-            </w:pPr>
-            <w:r>
-              <w:rPr>
-                <w:rFonts w:ascii="Times New Roman" w:hAnsi="Times New Roman" w:cs="Times New Roman"/>
-                <w:sz w:val="20"/>
-                <w:szCs w:val="20"/>
-              </w:rPr>
-              <w:t>+toString(): String</w:t>
-            </w:r>
-          </w:p>
-        </w:tc>
-      </w:tr>
-    </w:tbl>
-    <w:tbl>
-      <w:tblPr>
-        <w:tblStyle w:val="TableGrid"/>
-        <w:tblpPr w:leftFromText="180" w:rightFromText="180" w:vertAnchor="text" w:horzAnchor="page" w:tblpX="4687" w:tblpY="18"/>
-        <w:tblW w:w="0" w:type="auto"/>
-        <w:tblLook w:val="04A0" w:firstRow="1" w:lastRow="0" w:firstColumn="1" w:lastColumn="0" w:noHBand="0" w:noVBand="1"/>
-      </w:tblPr>
-      <w:tblGrid>
-        <w:gridCol w:w="1557"/>
-      </w:tblGrid>
-      <w:tr>
-        <w:tc>
-          <w:tcPr>
-            <w:tcW w:w="1557" w:type="dxa"/>
-            <w:shd w:val="clear" w:color="auto" w:fill="FFF2CC" w:themeFill="accent4" w:themeFillTint="33"/>
-          </w:tcPr>
-          <w:p>
-            <w:pPr>
-              <w:rPr>
-                <w:rFonts w:ascii="Times New Roman" w:hAnsi="Times New Roman" w:cs="Times New Roman"/>
-                <w:i/>
-                <w:iCs/>
-              </w:rPr>
-            </w:pPr>
-            <w:r>
-              <w:rPr>
-                <w:rFonts w:ascii="Times New Roman" w:hAnsi="Times New Roman" w:cs="Times New Roman"/>
-                <w:i/>
-                <w:iCs/>
-              </w:rPr>
-              <w:t>&lt;&lt;Control&gt;&gt;</w:t>
-            </w:r>
-          </w:p>
-          <w:p>
-            <w:pPr>
-              <w:rPr>
-                <w:rFonts w:ascii="Times New Roman" w:hAnsi="Times New Roman" w:cs="Times New Roman"/>
-              </w:rPr>
-            </w:pPr>
-            <w:r>
-              <w:rPr>
-                <w:rFonts w:ascii="Times New Roman" w:hAnsi="Times New Roman" w:cs="Times New Roman"/>
-              </w:rPr>
-              <w:t xml:space="preserve">     cccccc</w:t>
-            </w:r>
-          </w:p>
-        </w:tc>
-      </w:tr>
-      <w:tr>
-        <w:tc>
-          <w:tcPr>
-            <w:tcW w:w="1557" w:type="dxa"/>
-            <w:shd w:val="clear" w:color="auto" w:fill="FFF2CC" w:themeFill="accent4" w:themeFillTint="33"/>
-          </w:tcPr>
-          <w:p>
-            <w:pPr>
-              <w:rPr>
-                <w:rFonts w:ascii="Times New Roman" w:hAnsi="Times New Roman" w:cs="Times New Roman"/>
-              </w:rPr>
-            </w:pPr>
-          </w:p>
-        </w:tc>
-      </w:tr>
-      <w:tr>
-        <w:tc>
-          <w:tcPr>
-            <w:tcW w:w="1557" w:type="dxa"/>
-            <w:shd w:val="clear" w:color="auto" w:fill="FFF2CC" w:themeFill="accent4" w:themeFillTint="33"/>
-          </w:tcPr>
-          <w:p>
-            <w:pPr>
-              <w:rPr>
-                <w:rFonts w:ascii="Times New Roman" w:hAnsi="Times New Roman" w:cs="Times New Roman"/>
-              </w:rPr>
-            </w:pPr>
-          </w:p>
-        </w:tc>
-      </w:tr>
-    </w:tbl>
-    <w:p>
-      <w:pPr>
-        <w:rPr>
-          <w:rFonts w:ascii="Times New Roman" w:hAnsi="Times New Roman" w:cs="Times New Roman"/>
-        </w:rPr>
-      </w:pPr>
-    </w:p>
-    <w:p>
-      <w:pPr>
-        <w:rPr>
-          <w:rFonts w:ascii="Times New Roman" w:hAnsi="Times New Roman" w:cs="Times New Roman"/>
-        </w:rPr>
-      </w:pPr>
-    </w:p>
-    <w:p>
-      <w:pPr>
-        <w:rPr>
-          <w:rFonts w:ascii="Times New Roman" w:hAnsi="Times New Roman" w:cs="Times New Roman"/>
-        </w:rPr>
-      </w:pPr>
-    </w:p>
-    <w:p>
-      <w:pPr>
-        <w:rPr>
-          <w:rFonts w:ascii="Times New Roman" w:hAnsi="Times New Roman" w:cs="Times New Roman"/>
-        </w:rPr>
-      </w:pPr>
-    </w:p>
-    <w:p>
-      <w:pPr>
-        <w:rPr>
-          <w:rFonts w:ascii="Times New Roman" w:hAnsi="Times New Roman" w:cs="Times New Roman"/>
-        </w:rPr>
-      </w:pPr>
     </w:p>
     <w:p>
       <w:pPr>
@@ -30265,7 +29467,7 @@
       </w:pPr>
     </w:p>
     <w:sectPr>
-      <w:footerReference w:type="default" r:id="rId43"/>
+      <w:footerReference w:type="default" r:id="rId45"/>
       <w:pgSz w:w="12240" w:h="15840" w:code="1"/>
       <w:pgMar w:top="851" w:right="851" w:bottom="851" w:left="1134" w:header="567" w:footer="567" w:gutter="0"/>
       <w:pgNumType w:start="0"/>
@@ -32384,6 +31586,7 @@
   <w:style w:type="character" w:default="1" w:styleId="DefaultParagraphFont">
     <w:name w:val="Default Paragraph Font"/>
     <w:uiPriority w:val="1"/>
+    <w:semiHidden/>
     <w:unhideWhenUsed/>
   </w:style>
   <w:style w:type="table" w:default="1" w:styleId="TableNormal">
@@ -32940,6 +32143,8 @@
     <w:rsid w:val="003D3D84"/>
     <w:rsid w:val="00416DE4"/>
     <w:rsid w:val="0046780C"/>
+    <w:rsid w:val="004C4FC1"/>
+    <w:rsid w:val="006F2D6E"/>
     <w:rsid w:val="0077570D"/>
     <w:rsid w:val="007D4F22"/>
     <w:rsid w:val="007D731E"/>

</xml_diff>